<commit_message>
Zillow materials after honesty check
Co-Authored-By: Claude Opus 5.5 <noreply@anthropic.com>
Claude-Session: https://claude.ai/code/session_01VpCXqDFSAKkK8y6mKL2HCw
</commit_message>
<xml_diff>
--- a/applications/zillow-video-content-producer/build/Joshua_Chappell_CoverLetter_Zillow.docx
+++ b/applications/zillow-video-content-producer/build/Joshua_Chappell_CoverLetter_Zillow.docx
@@ -27,7 +27,7 @@
         </w:rPr>
         <w:t xml:space="preserve">Mesa, AZ  •  480-586-7959  •  </w:t>
       </w:r>
-      <w:hyperlink w:history="1" r:id="rId6y42f8qsy4rveknimnkcf">
+      <w:hyperlink w:history="1" r:id="rId6rd0ltgtbtds6u4_3ogsy">
         <w:r>
           <w:rPr>
             <w:rFonts w:ascii="Calibri" w:cs="Calibri" w:eastAsia="Calibri" w:hAnsi="Calibri"/>
@@ -47,7 +47,7 @@
         </w:rPr>
         <w:t xml:space="preserve">  •  </w:t>
       </w:r>
-      <w:hyperlink w:history="1" r:id="rIdcneptn9vth8jz_fndmbnv">
+      <w:hyperlink w:history="1" r:id="rId9gqw7sqxxrwzzahqv9gxx">
         <w:r>
           <w:rPr>
             <w:rFonts w:ascii="Calibri" w:cs="Calibri" w:eastAsia="Calibri" w:hAnsi="Calibri"/>
@@ -67,7 +67,7 @@
         </w:rPr>
         <w:t xml:space="preserve">  •  </w:t>
       </w:r>
-      <w:hyperlink w:history="1" r:id="rIdisfq0iz8j_zclcazk8vlk">
+      <w:hyperlink w:history="1" r:id="rIdkisz_dapbkyxoqcu8f-ix">
         <w:r>
           <w:rPr>
             <w:rFonts w:ascii="Calibri" w:cs="Calibri" w:eastAsia="Calibri" w:hAnsi="Calibri"/>
@@ -87,7 +87,7 @@
         </w:rPr>
         <w:t xml:space="preserve">  •  </w:t>
       </w:r>
-      <w:hyperlink w:history="1" r:id="rIdsz5xknlfyj3pmjwb3be0y">
+      <w:hyperlink w:history="1" r:id="rId02m8s8pacq5nppxeynwnz">
         <w:r>
           <w:rPr>
             <w:rFonts w:ascii="Calibri" w:cs="Calibri" w:eastAsia="Calibri" w:hAnsi="Calibri"/>
@@ -138,7 +138,7 @@
           <w:sz w:val="22"/>
           <w:szCs w:val="22"/>
         </w:rPr>
-        <w:t xml:space="preserve">Your posting asks for someone to help build the engine behind StudioZ's growing video operation. I have run that kind of operation at my own company for seven years. At Lightbox Digital I take each project from intake through delivery. I delivered 98% of projects on time and 92% within budget, commanding crews of 5-20 people per project. I maintained an organized library of video assets in Frame.io and Dropbox, reducing search and retrieval time by over 50%, and I crafted storyboards that slashed back-and-forth communication by over 50%. At Charter One I built content workflows with Claude agentic coding that cut production times in half.</w:t>
+        <w:t xml:space="preserve">Your posting asks for someone to help build the engine behind StudioZ's growing video operation. I have run my own production company for seven years. At Lightbox Digital I take each project from intake through delivery. I delivered 98% of projects on time and 92% within budget, commanding crews of 5-20 people per project. I maintained an organized library of video assets in Frame.io and Dropbox, reducing search and retrieval time by over 50%, and I crafted storyboards that slashed back-and-forth communication by over 50%. At Charter One I built content workflows with Claude agentic coding that cut production times in half.</w:t>
       </w:r>
     </w:p>
     <w:p>
@@ -152,7 +152,7 @@
           <w:sz w:val="22"/>
           <w:szCs w:val="22"/>
         </w:rPr>
-        <w:t xml:space="preserve">You would get a producer who has worked every stage of the lifecycle, on set and in post. At Grand Canyon Education I delivered 200+ videos over two years reaching millions on TV, paid social, and organic channels, and I crystallized scope of work across departments with competing interests. Real estate is familiar ground: I filmed model home videos for Blandford Homes and photographed homes for realtors. I know the YouTube publishing side as a creator: I reached over a million people on YouTube teaching cutting-edge post production techniques.</w:t>
+        <w:t xml:space="preserve">You would get a producer who has worked across the video lifecycle, on set and in post. At Grand Canyon Education I delivered 200+ videos over two years reaching millions on TV, paid social, and organic channels, and I crystallized scope of work across departments with competing interests. Real estate is familiar ground: I filmed model home videos for Blandford Homes and photographed homes for realtors. I have published to YouTube as a creator: I reached over a million people on YouTube teaching post production techniques.</w:t>
       </w:r>
     </w:p>
     <w:p>

</xml_diff>